<commit_message>
Arreglo de Caratula Documentacion
</commit_message>
<xml_diff>
--- a/Documentacion/SmartGastro_Documentacion.docx
+++ b/Documentacion/SmartGastro_Documentacion.docx
@@ -4,61 +4,276 @@
   <w:body>
     <w:p>
       <w:pPr>
+        <w:spacing w:after="0"/>
         <w:jc w:val="center"/>
         <w:rPr>
           <w:rFonts w:ascii="Roboto" w:hAnsi="Roboto"/>
-          <w:sz w:val="96"/>
-          <w:szCs w:val="96"/>
-        </w:rPr>
-      </w:pPr>
-      <w:r>
-        <w:rPr>
-          <w:rFonts w:ascii="Roboto" w:hAnsi="Roboto"/>
-          <w:sz w:val="96"/>
-          <w:szCs w:val="96"/>
-        </w:rPr>
-        <w:t xml:space="preserve">Sistema de Gestión de </w:t>
-      </w:r>
-      <w:proofErr w:type="spellStart"/>
-      <w:r>
-        <w:rPr>
-          <w:rFonts w:ascii="Roboto" w:hAnsi="Roboto"/>
-          <w:sz w:val="96"/>
-          <w:szCs w:val="96"/>
-        </w:rPr>
-        <w:t>Foodtrucks</w:t>
-      </w:r>
-      <w:proofErr w:type="spellEnd"/>
-    </w:p>
-    <w:p>
-      <w:pPr>
-        <w:jc w:val="center"/>
-        <w:rPr>
-          <w:rFonts w:ascii="Roboto" w:hAnsi="Roboto"/>
-          <w:sz w:val="96"/>
-          <w:szCs w:val="96"/>
-        </w:rPr>
-      </w:pPr>
-    </w:p>
-    <w:p>
-      <w:pPr>
+          <w:sz w:val="72"/>
+          <w:szCs w:val="72"/>
+        </w:rPr>
+      </w:pPr>
+      <w:r>
+        <w:rPr>
+          <w:rFonts w:ascii="Roboto" w:hAnsi="Roboto"/>
+          <w:sz w:val="72"/>
+          <w:szCs w:val="72"/>
+        </w:rPr>
+        <w:t>SISTEMA DE GESTIÓN DE FOODTRUCKS</w:t>
+      </w:r>
+    </w:p>
+    <w:p>
+      <w:pPr>
+        <w:spacing w:after="0"/>
         <w:rPr>
           <w:rFonts w:ascii="Roboto" w:hAnsi="Roboto"/>
           <w:sz w:val="44"/>
           <w:szCs w:val="44"/>
         </w:rPr>
       </w:pPr>
-      <w:r>
+    </w:p>
+    <w:p>
+      <w:pPr>
+        <w:spacing w:after="0"/>
         <w:rPr>
           <w:rFonts w:ascii="Roboto" w:hAnsi="Roboto"/>
           <w:sz w:val="44"/>
           <w:szCs w:val="44"/>
         </w:rPr>
-        <w:t>Materia: Análisis y Metodología de Estudio</w:t>
-      </w:r>
-    </w:p>
-    <w:p>
-      <w:pPr>
+      </w:pPr>
+    </w:p>
+    <w:p>
+      <w:pPr>
+        <w:spacing w:after="0"/>
+        <w:rPr>
+          <w:rFonts w:ascii="Roboto" w:hAnsi="Roboto"/>
+          <w:sz w:val="32"/>
+          <w:szCs w:val="32"/>
+        </w:rPr>
+      </w:pPr>
+      <w:r>
+        <w:rPr>
+          <w:rFonts w:ascii="Roboto" w:hAnsi="Roboto"/>
+          <w:sz w:val="32"/>
+          <w:szCs w:val="32"/>
+        </w:rPr>
+        <w:t>Materia:</w:t>
+      </w:r>
+    </w:p>
+    <w:p>
+      <w:pPr>
+        <w:spacing w:after="0"/>
+        <w:rPr>
+          <w:rFonts w:ascii="Roboto" w:hAnsi="Roboto"/>
+          <w:sz w:val="32"/>
+          <w:szCs w:val="32"/>
+        </w:rPr>
+      </w:pPr>
+      <w:r>
+        <w:rPr>
+          <w:rFonts w:ascii="Roboto" w:hAnsi="Roboto"/>
+          <w:sz w:val="32"/>
+          <w:szCs w:val="32"/>
+        </w:rPr>
+        <w:t>Análisis y Metodología de Estudio</w:t>
+      </w:r>
+    </w:p>
+    <w:p>
+      <w:pPr>
+        <w:spacing w:after="0"/>
+        <w:rPr>
+          <w:rFonts w:ascii="Roboto" w:hAnsi="Roboto"/>
+          <w:sz w:val="32"/>
+          <w:szCs w:val="32"/>
+        </w:rPr>
+      </w:pPr>
+    </w:p>
+    <w:p>
+      <w:pPr>
+        <w:spacing w:after="0"/>
+        <w:rPr>
+          <w:rFonts w:ascii="Roboto" w:hAnsi="Roboto"/>
+          <w:sz w:val="32"/>
+          <w:szCs w:val="32"/>
+        </w:rPr>
+      </w:pPr>
+      <w:r>
+        <w:rPr>
+          <w:rFonts w:ascii="Roboto" w:hAnsi="Roboto"/>
+          <w:sz w:val="32"/>
+          <w:szCs w:val="32"/>
+        </w:rPr>
+        <w:t>Docente:</w:t>
+      </w:r>
+    </w:p>
+    <w:p>
+      <w:pPr>
+        <w:spacing w:after="0"/>
+        <w:rPr>
+          <w:rFonts w:ascii="Roboto" w:hAnsi="Roboto"/>
+          <w:sz w:val="32"/>
+          <w:szCs w:val="32"/>
+        </w:rPr>
+      </w:pPr>
+      <w:r>
+        <w:rPr>
+          <w:rFonts w:ascii="Roboto" w:hAnsi="Roboto"/>
+          <w:sz w:val="32"/>
+          <w:szCs w:val="32"/>
+        </w:rPr>
+        <w:t>Juan Sebastián Stenico</w:t>
+      </w:r>
+    </w:p>
+    <w:p>
+      <w:pPr>
+        <w:spacing w:after="0"/>
+        <w:rPr>
+          <w:rFonts w:ascii="Roboto" w:hAnsi="Roboto"/>
+          <w:sz w:val="32"/>
+          <w:szCs w:val="32"/>
+        </w:rPr>
+      </w:pPr>
+    </w:p>
+    <w:p>
+      <w:pPr>
+        <w:spacing w:after="0"/>
+        <w:rPr>
+          <w:rFonts w:ascii="Roboto" w:hAnsi="Roboto"/>
+          <w:sz w:val="32"/>
+          <w:szCs w:val="32"/>
+        </w:rPr>
+      </w:pPr>
+      <w:r>
+        <w:rPr>
+          <w:rFonts w:ascii="Roboto" w:hAnsi="Roboto"/>
+          <w:sz w:val="32"/>
+          <w:szCs w:val="32"/>
+        </w:rPr>
+        <w:t>Integrante:</w:t>
+      </w:r>
+    </w:p>
+    <w:p>
+      <w:pPr>
+        <w:spacing w:after="0"/>
+        <w:rPr>
+          <w:rFonts w:ascii="Roboto" w:hAnsi="Roboto"/>
+          <w:sz w:val="32"/>
+          <w:szCs w:val="32"/>
+        </w:rPr>
+      </w:pPr>
+      <w:r>
+        <w:rPr>
+          <w:rFonts w:ascii="Roboto" w:hAnsi="Roboto"/>
+          <w:sz w:val="32"/>
+          <w:szCs w:val="32"/>
+        </w:rPr>
+        <w:t>Alejandro Ribera</w:t>
+      </w:r>
+    </w:p>
+    <w:p>
+      <w:pPr>
+        <w:spacing w:after="0"/>
+        <w:rPr>
+          <w:rFonts w:ascii="Roboto" w:hAnsi="Roboto"/>
+          <w:sz w:val="32"/>
+          <w:szCs w:val="32"/>
+        </w:rPr>
+      </w:pPr>
+    </w:p>
+    <w:p>
+      <w:pPr>
+        <w:spacing w:after="0"/>
+        <w:rPr>
+          <w:rFonts w:ascii="Roboto" w:hAnsi="Roboto"/>
+          <w:sz w:val="32"/>
+          <w:szCs w:val="32"/>
+        </w:rPr>
+      </w:pPr>
+      <w:r>
+        <w:rPr>
+          <w:rFonts w:ascii="Roboto" w:hAnsi="Roboto"/>
+          <w:sz w:val="32"/>
+          <w:szCs w:val="32"/>
+        </w:rPr>
+        <w:t>Repo</w:t>
+      </w:r>
+      <w:r>
+        <w:rPr>
+          <w:rFonts w:ascii="Roboto" w:hAnsi="Roboto"/>
+          <w:sz w:val="32"/>
+          <w:szCs w:val="32"/>
+        </w:rPr>
+        <w:t xml:space="preserve"> de</w:t>
+      </w:r>
+      <w:r>
+        <w:rPr>
+          <w:rFonts w:ascii="Roboto" w:hAnsi="Roboto"/>
+          <w:sz w:val="32"/>
+          <w:szCs w:val="32"/>
+        </w:rPr>
+        <w:t xml:space="preserve"> GitHub:</w:t>
+      </w:r>
+      <w:r>
+        <w:rPr>
+          <w:rFonts w:ascii="Roboto" w:hAnsi="Roboto"/>
+          <w:sz w:val="32"/>
+          <w:szCs w:val="32"/>
+        </w:rPr>
+        <w:t xml:space="preserve"> </w:t>
+      </w:r>
+      <w:hyperlink r:id="rId6" w:history="1">
+        <w:r>
+          <w:rPr>
+            <w:rStyle w:val="Hipervnculo"/>
+            <w:rFonts w:ascii="Roboto" w:hAnsi="Roboto"/>
+            <w:sz w:val="32"/>
+            <w:szCs w:val="32"/>
+          </w:rPr>
+          <w:t>https://github.com/AlejandroRibera1987/SmartGastro</w:t>
+        </w:r>
+      </w:hyperlink>
+    </w:p>
+    <w:p>
+      <w:pPr>
+        <w:spacing w:after="0"/>
+        <w:rPr>
+          <w:rFonts w:ascii="Roboto" w:hAnsi="Roboto"/>
+          <w:sz w:val="32"/>
+          <w:szCs w:val="32"/>
+        </w:rPr>
+      </w:pPr>
+    </w:p>
+    <w:p>
+      <w:pPr>
+        <w:spacing w:after="0"/>
+        <w:rPr>
+          <w:rFonts w:ascii="Roboto" w:hAnsi="Roboto"/>
+          <w:sz w:val="32"/>
+          <w:szCs w:val="32"/>
+        </w:rPr>
+      </w:pPr>
+    </w:p>
+    <w:p>
+      <w:pPr>
+        <w:spacing w:after="0"/>
+        <w:rPr>
+          <w:rFonts w:ascii="Roboto" w:hAnsi="Roboto"/>
+          <w:sz w:val="32"/>
+          <w:szCs w:val="32"/>
+        </w:rPr>
+      </w:pPr>
+    </w:p>
+    <w:p>
+      <w:pPr>
+        <w:rPr>
+          <w:rFonts w:ascii="Roboto" w:hAnsi="Roboto"/>
+          <w:sz w:val="22"/>
+          <w:szCs w:val="22"/>
+        </w:rPr>
+      </w:pPr>
+    </w:p>
+    <w:p>
+      <w:pPr>
+        <w:jc w:val="center"/>
         <w:rPr>
           <w:rFonts w:ascii="Roboto" w:hAnsi="Roboto"/>
           <w:sz w:val="44"/>
@@ -71,46 +286,50 @@
           <w:sz w:val="44"/>
           <w:szCs w:val="44"/>
         </w:rPr>
-        <w:t>Docente:</w:t>
-      </w:r>
-    </w:p>
-    <w:p>
-      <w:pPr>
+        <w:t xml:space="preserve">Sistema desarrollado en </w:t>
+      </w:r>
+      <w:r>
         <w:rPr>
           <w:rFonts w:ascii="Roboto" w:hAnsi="Roboto"/>
           <w:sz w:val="44"/>
           <w:szCs w:val="44"/>
         </w:rPr>
-      </w:pPr>
-    </w:p>
-    <w:p>
-      <w:pPr>
+        <w:t>Python</w:t>
+      </w:r>
+    </w:p>
+    <w:p>
+      <w:pPr>
+        <w:jc w:val="center"/>
         <w:rPr>
           <w:rFonts w:ascii="Roboto" w:hAnsi="Roboto"/>
           <w:sz w:val="44"/>
           <w:szCs w:val="44"/>
         </w:rPr>
       </w:pPr>
-    </w:p>
-    <w:p>
-      <w:pPr>
+      <w:r>
         <w:rPr>
           <w:rFonts w:ascii="Roboto" w:hAnsi="Roboto"/>
           <w:sz w:val="44"/>
           <w:szCs w:val="44"/>
         </w:rPr>
-      </w:pPr>
-      <w:r>
+        <w:t>Análisis • Diagramación • API REST • Modelado</w:t>
+      </w:r>
+    </w:p>
+    <w:p>
+      <w:pPr>
+        <w:spacing w:after="0"/>
+        <w:jc w:val="center"/>
         <w:rPr>
           <w:rFonts w:ascii="Roboto" w:hAnsi="Roboto"/>
           <w:sz w:val="44"/>
           <w:szCs w:val="44"/>
         </w:rPr>
-        <w:t>Integrantes: Alejandro Ribera</w:t>
-      </w:r>
-    </w:p>
-    <w:p>
-      <w:pPr>
+      </w:pPr>
+    </w:p>
+    <w:p>
+      <w:pPr>
+        <w:spacing w:after="0"/>
+        <w:jc w:val="center"/>
         <w:rPr>
           <w:rFonts w:ascii="Roboto" w:hAnsi="Roboto"/>
           <w:sz w:val="44"/>
@@ -120,24 +339,27 @@
     </w:p>
     <w:p>
       <w:pPr>
+        <w:spacing w:after="0"/>
+        <w:jc w:val="center"/>
         <w:rPr>
           <w:rFonts w:ascii="Roboto" w:hAnsi="Roboto"/>
           <w:sz w:val="44"/>
           <w:szCs w:val="44"/>
         </w:rPr>
       </w:pPr>
-    </w:p>
-    <w:p>
-      <w:pPr>
+      <w:r>
         <w:rPr>
           <w:rFonts w:ascii="Roboto" w:hAnsi="Roboto"/>
           <w:sz w:val="44"/>
           <w:szCs w:val="44"/>
         </w:rPr>
-      </w:pPr>
-    </w:p>
-    <w:p>
-      <w:pPr>
+        <w:t>Fecha de Entrega:</w:t>
+      </w:r>
+    </w:p>
+    <w:p>
+      <w:pPr>
+        <w:spacing w:after="0"/>
+        <w:jc w:val="center"/>
         <w:rPr>
           <w:rFonts w:ascii="Roboto" w:hAnsi="Roboto"/>
           <w:sz w:val="44"/>
@@ -150,7 +372,7 @@
           <w:sz w:val="44"/>
           <w:szCs w:val="44"/>
         </w:rPr>
-        <w:t>Fecha de Entrega: 8/05/2026</w:t>
+        <w:t>08/05/2026</w:t>
       </w:r>
     </w:p>
     <w:p>
@@ -175,35 +397,16 @@
       <w:pPr>
         <w:rPr>
           <w:rFonts w:ascii="Roboto" w:hAnsi="Roboto"/>
-          <w:sz w:val="44"/>
-          <w:szCs w:val="44"/>
-        </w:rPr>
-      </w:pPr>
-    </w:p>
-    <w:p>
-      <w:pPr>
-        <w:rPr>
-          <w:rFonts w:ascii="Roboto" w:hAnsi="Roboto"/>
-          <w:sz w:val="44"/>
-          <w:szCs w:val="44"/>
-        </w:rPr>
-      </w:pPr>
-    </w:p>
-    <w:p>
-      <w:pPr>
-        <w:rPr>
-          <w:rFonts w:ascii="Roboto" w:hAnsi="Roboto"/>
-          <w:sz w:val="32"/>
-          <w:szCs w:val="32"/>
-        </w:rPr>
-      </w:pPr>
-      <w:r>
-        <w:rPr>
-          <w:rFonts w:ascii="Roboto" w:hAnsi="Roboto"/>
-          <w:sz w:val="32"/>
-          <w:szCs w:val="32"/>
-        </w:rPr>
-        <w:lastRenderedPageBreak/>
+          <w:sz w:val="32"/>
+          <w:szCs w:val="32"/>
+        </w:rPr>
+      </w:pPr>
+      <w:r>
+        <w:rPr>
+          <w:rFonts w:ascii="Roboto" w:hAnsi="Roboto"/>
+          <w:sz w:val="32"/>
+          <w:szCs w:val="32"/>
+        </w:rPr>
         <w:t>Introducción</w:t>
       </w:r>
       <w:r>
@@ -654,24 +857,6 @@
       <w:pPr>
         <w:rPr>
           <w:rFonts w:ascii="Roboto" w:hAnsi="Roboto"/>
-          <w:sz w:val="44"/>
-          <w:szCs w:val="44"/>
-        </w:rPr>
-      </w:pPr>
-    </w:p>
-    <w:p>
-      <w:pPr>
-        <w:rPr>
-          <w:rFonts w:ascii="Roboto" w:hAnsi="Roboto"/>
-          <w:sz w:val="44"/>
-          <w:szCs w:val="44"/>
-        </w:rPr>
-      </w:pPr>
-    </w:p>
-    <w:p>
-      <w:pPr>
-        <w:rPr>
-          <w:rFonts w:ascii="Roboto" w:hAnsi="Roboto"/>
           <w:sz w:val="32"/>
           <w:szCs w:val="32"/>
         </w:rPr>
@@ -1056,14 +1241,7 @@
         <w:rPr>
           <w:rFonts w:ascii="Roboto" w:hAnsi="Roboto"/>
         </w:rPr>
-        <w:t xml:space="preserve"> funcionalidades avanzadas </w:t>
-      </w:r>
-      <w:r>
-        <w:rPr>
-          <w:rFonts w:ascii="Roboto" w:hAnsi="Roboto"/>
-        </w:rPr>
-        <w:lastRenderedPageBreak/>
-        <w:t xml:space="preserve">como reportes, alerta de stock, integración con </w:t>
+        <w:t xml:space="preserve"> funcionalidades avanzadas como reportes, alerta de stock, integración con </w:t>
       </w:r>
       <w:proofErr w:type="spellStart"/>
       <w:r>
@@ -1095,6 +1273,7 @@
         <w:rPr>
           <w:rFonts w:ascii="Roboto" w:hAnsi="Roboto"/>
         </w:rPr>
+        <w:lastRenderedPageBreak/>
         <w:t>Plan Premium: Incluye herramientas adicionales como análisis de ventas, predicción de stock y soporte prioritario.</w:t>
       </w:r>
     </w:p>
@@ -1276,6 +1455,16 @@
         </w:rPr>
         <w:t>Como usuario, quiero información del clima, para decidir si conviene asistir a un evento o no.</w:t>
       </w:r>
+    </w:p>
+    <w:p>
+      <w:pPr>
+        <w:jc w:val="center"/>
+        <w:rPr>
+          <w:rFonts w:ascii="Roboto" w:hAnsi="Roboto"/>
+          <w:sz w:val="44"/>
+          <w:szCs w:val="44"/>
+        </w:rPr>
+      </w:pPr>
     </w:p>
     <w:p>
       <w:pPr>
@@ -1421,7 +1610,7 @@
                     <pic:cNvPicPr/>
                   </pic:nvPicPr>
                   <pic:blipFill>
-                    <a:blip r:embed="rId6"/>
+                    <a:blip r:embed="rId7"/>
                     <a:stretch>
                       <a:fillRect/>
                     </a:stretch>
@@ -1499,7 +1688,7 @@
                     <pic:cNvPicPr/>
                   </pic:nvPicPr>
                   <pic:blipFill>
-                    <a:blip r:embed="rId7"/>
+                    <a:blip r:embed="rId8"/>
                     <a:stretch>
                       <a:fillRect/>
                     </a:stretch>
@@ -1569,7 +1758,7 @@
                     <pic:cNvPicPr/>
                   </pic:nvPicPr>
                   <pic:blipFill>
-                    <a:blip r:embed="rId8"/>
+                    <a:blip r:embed="rId9"/>
                     <a:stretch>
                       <a:fillRect/>
                     </a:stretch>
@@ -2138,7 +2327,7 @@
     </w:p>
     <w:sectPr>
       <w:pgSz w:w="11906" w:h="16838"/>
-      <w:pgMar w:top="993" w:right="1701" w:bottom="1702" w:left="1701" w:header="708" w:footer="708" w:gutter="0"/>
+      <w:pgMar w:top="993" w:right="991" w:bottom="1702" w:left="1701" w:header="708" w:footer="708" w:gutter="0"/>
       <w:cols w:space="708"/>
       <w:docGrid w:linePitch="360"/>
     </w:sectPr>
@@ -3566,7 +3755,6 @@
   <w:style w:type="character" w:default="1" w:styleId="Fuentedeprrafopredeter">
     <w:name w:val="Default Paragraph Font"/>
     <w:uiPriority w:val="1"/>
-    <w:semiHidden/>
     <w:unhideWhenUsed/>
   </w:style>
   <w:style w:type="table" w:default="1" w:styleId="Tablanormal">
@@ -3878,6 +4066,29 @@
       <w:smallCaps/>
       <w:color w:val="0F4761" w:themeColor="accent1" w:themeShade="BF"/>
       <w:spacing w:val="5"/>
+    </w:rPr>
+  </w:style>
+  <w:style w:type="character" w:styleId="Hipervnculo">
+    <w:name w:val="Hyperlink"/>
+    <w:basedOn w:val="Fuentedeprrafopredeter"/>
+    <w:uiPriority w:val="99"/>
+    <w:unhideWhenUsed/>
+    <w:rsid w:val="006C2AF5"/>
+    <w:rPr>
+      <w:color w:val="467886" w:themeColor="hyperlink"/>
+      <w:u w:val="single"/>
+    </w:rPr>
+  </w:style>
+  <w:style w:type="character" w:styleId="Mencinsinresolver">
+    <w:name w:val="Unresolved Mention"/>
+    <w:basedOn w:val="Fuentedeprrafopredeter"/>
+    <w:uiPriority w:val="99"/>
+    <w:semiHidden/>
+    <w:unhideWhenUsed/>
+    <w:rsid w:val="006C2AF5"/>
+    <w:rPr>
+      <w:color w:val="605E5C"/>
+      <w:shd w:val="clear" w:color="auto" w:fill="E1DFDD"/>
     </w:rPr>
   </w:style>
 </w:styles>

</xml_diff>